<commit_message>
Finalize climate project submission files
</commit_message>
<xml_diff>
--- a/paper/research_paper_final.docx
+++ b/paper/research_paper_final.docx
@@ -13,6 +13,55 @@
           <w:szCs w:val="52"/>
         </w:rPr>
       </w:pPr>
+      <w:r>
+        <w:rPr>
+          <w:rFonts w:ascii="Calibri" w:hAnsi="Calibri" w:eastAsia="Calibri" w:cs="Calibri"/>
+          <w:sz w:val="36"/>
+          <w:szCs w:val="36"/>
+        </w:rPr>
+        <w:drawing>
+          <wp:anchor distT="0" distB="0" distL="114300" distR="114300" simplePos="0" relativeHeight="251659264" behindDoc="0" locked="0" layoutInCell="1" allowOverlap="1">
+            <wp:simplePos x="0" y="0"/>
+            <wp:positionH relativeFrom="margin">
+              <wp:posOffset>1859915</wp:posOffset>
+            </wp:positionH>
+            <wp:positionV relativeFrom="margin">
+              <wp:posOffset>-446405</wp:posOffset>
+            </wp:positionV>
+            <wp:extent cx="1895475" cy="1862455"/>
+            <wp:effectExtent l="0" t="0" r="9525" b="4445"/>
+            <wp:wrapSquare wrapText="bothSides"/>
+            <wp:docPr id="14" name="image1.png" descr="C:\Users\shoaib.rauf\Desktop\islamabad\National_University_of_Computer_and_Emerging_Sciences_logo.png"/>
+            <wp:cNvGraphicFramePr/>
+            <a:graphic xmlns:a="http://schemas.openxmlformats.org/drawingml/2006/main">
+              <a:graphicData uri="http://schemas.openxmlformats.org/drawingml/2006/picture">
+                <pic:pic xmlns:pic="http://schemas.openxmlformats.org/drawingml/2006/picture">
+                  <pic:nvPicPr>
+                    <pic:cNvPr id="14" name="image1.png" descr="C:\Users\shoaib.rauf\Desktop\islamabad\National_University_of_Computer_and_Emerging_Sciences_logo.png"/>
+                    <pic:cNvPicPr preferRelativeResize="0"/>
+                  </pic:nvPicPr>
+                  <pic:blipFill>
+                    <a:blip r:embed="rId7"/>
+                    <a:srcRect/>
+                    <a:stretch>
+                      <a:fillRect/>
+                    </a:stretch>
+                  </pic:blipFill>
+                  <pic:spPr>
+                    <a:xfrm>
+                      <a:off x="0" y="0"/>
+                      <a:ext cx="1895475" cy="1862455"/>
+                    </a:xfrm>
+                    <a:prstGeom prst="rect">
+                      <a:avLst/>
+                    </a:prstGeom>
+                  </pic:spPr>
+                </pic:pic>
+              </a:graphicData>
+            </a:graphic>
+          </wp:anchor>
+        </w:drawing>
+      </w:r>
     </w:p>
     <w:p>
       <w:pPr>
@@ -25,8 +74,66 @@
           <w:szCs w:val="52"/>
         </w:rPr>
       </w:pPr>
-      <w:bookmarkStart w:id="0" w:name="_GoBack"/>
-      <w:bookmarkEnd w:id="0"/>
+    </w:p>
+    <w:p>
+      <w:pPr>
+        <w:spacing w:before="0" w:after="0" w:line="360" w:lineRule="auto"/>
+        <w:jc w:val="center"/>
+        <w:rPr>
+          <w:rFonts w:ascii="Times New Roman" w:hAnsi="Times New Roman" w:eastAsia="Times New Roman"/>
+          <w:b/>
+          <w:sz w:val="36"/>
+          <w:szCs w:val="36"/>
+        </w:rPr>
+      </w:pPr>
+    </w:p>
+    <w:p>
+      <w:pPr>
+        <w:spacing w:before="0" w:after="0" w:line="360" w:lineRule="auto"/>
+        <w:jc w:val="center"/>
+        <w:rPr>
+          <w:rFonts w:hint="default" w:ascii="Cambria" w:hAnsi="Cambria" w:eastAsia="SimSun" w:cs="Cambria"/>
+          <w:b/>
+          <w:bCs/>
+          <w:sz w:val="40"/>
+          <w:szCs w:val="40"/>
+        </w:rPr>
+      </w:pPr>
+      <w:r>
+        <w:rPr>
+          <w:rFonts w:hint="default" w:ascii="Cambria" w:hAnsi="Cambria" w:eastAsia="SimSun" w:cs="Cambria"/>
+          <w:b/>
+          <w:bCs/>
+          <w:sz w:val="40"/>
+          <w:szCs w:val="40"/>
+        </w:rPr>
+        <w:t>FAST National University of Computer and Emerging Sciences (FAST-NUCES)</w:t>
+      </w:r>
+    </w:p>
+    <w:p>
+      <w:pPr>
+        <w:spacing w:before="0" w:after="0" w:line="360" w:lineRule="auto"/>
+        <w:jc w:val="both"/>
+        <w:rPr>
+          <w:rFonts w:hint="default" w:ascii="Cambria" w:hAnsi="Cambria" w:eastAsia="SimSun" w:cs="Cambria"/>
+          <w:b/>
+          <w:bCs/>
+          <w:sz w:val="36"/>
+          <w:szCs w:val="36"/>
+        </w:rPr>
+      </w:pPr>
+    </w:p>
+    <w:p>
+      <w:pPr>
+        <w:spacing w:before="0" w:after="0" w:line="360" w:lineRule="auto"/>
+        <w:jc w:val="center"/>
+        <w:rPr>
+          <w:rFonts w:ascii="Times New Roman" w:hAnsi="Times New Roman" w:eastAsia="Times New Roman"/>
+          <w:b/>
+          <w:sz w:val="52"/>
+          <w:szCs w:val="52"/>
+        </w:rPr>
+      </w:pPr>
       <w:r>
         <w:rPr>
           <w:rFonts w:ascii="Times New Roman" w:hAnsi="Times New Roman" w:eastAsia="Times New Roman"/>
@@ -118,16 +225,35 @@
         <w:spacing w:before="0" w:after="0" w:line="360" w:lineRule="auto"/>
         <w:jc w:val="center"/>
         <w:rPr>
-          <w:sz w:val="40"/>
-          <w:szCs w:val="40"/>
+          <w:rFonts w:hint="default"/>
+          <w:b/>
+          <w:bCs/>
+          <w:sz w:val="44"/>
+          <w:szCs w:val="44"/>
+          <w:u w:val="single"/>
+          <w:lang w:val="en-US"/>
         </w:rPr>
       </w:pPr>
+      <w:r>
+        <w:rPr>
+          <w:rFonts w:hint="default"/>
+          <w:b/>
+          <w:bCs/>
+          <w:sz w:val="44"/>
+          <w:szCs w:val="44"/>
+          <w:u w:val="single"/>
+          <w:lang w:val="en-US"/>
+        </w:rPr>
+        <w:t>Group members:</w:t>
+      </w:r>
     </w:p>
     <w:p>
       <w:pPr>
         <w:spacing w:before="0" w:after="0" w:line="360" w:lineRule="auto"/>
         <w:jc w:val="center"/>
         <w:rPr>
+          <w:rFonts w:ascii="Times New Roman" w:hAnsi="Times New Roman" w:eastAsia="Times New Roman"/>
+          <w:b w:val="0"/>
           <w:sz w:val="44"/>
           <w:szCs w:val="44"/>
         </w:rPr>
@@ -139,7 +265,72 @@
           <w:sz w:val="44"/>
           <w:szCs w:val="44"/>
         </w:rPr>
-        <w:t>Gotam Kumar (23k-0860)</w:t>
+        <w:t>Gotam Kumar (23</w:t>
+      </w:r>
+      <w:r>
+        <w:rPr>
+          <w:rFonts w:hint="default"/>
+          <w:b w:val="0"/>
+          <w:sz w:val="44"/>
+          <w:szCs w:val="44"/>
+          <w:lang w:val="en-US"/>
+        </w:rPr>
+        <w:t>K</w:t>
+      </w:r>
+      <w:r>
+        <w:rPr>
+          <w:rFonts w:ascii="Times New Roman" w:hAnsi="Times New Roman" w:eastAsia="Times New Roman"/>
+          <w:b w:val="0"/>
+          <w:sz w:val="44"/>
+          <w:szCs w:val="44"/>
+        </w:rPr>
+        <w:t>-0860)</w:t>
+      </w:r>
+    </w:p>
+    <w:p>
+      <w:pPr>
+        <w:spacing w:before="0" w:after="0" w:line="360" w:lineRule="auto"/>
+        <w:jc w:val="center"/>
+        <w:rPr>
+          <w:rFonts w:hint="default"/>
+          <w:b w:val="0"/>
+          <w:sz w:val="44"/>
+          <w:szCs w:val="44"/>
+          <w:lang w:val="en-US"/>
+        </w:rPr>
+      </w:pPr>
+      <w:r>
+        <w:rPr>
+          <w:rFonts w:hint="default"/>
+          <w:b w:val="0"/>
+          <w:sz w:val="44"/>
+          <w:szCs w:val="44"/>
+          <w:lang w:val="en-US"/>
+        </w:rPr>
+        <w:t>Uzair Mustafa (23I-0827)</w:t>
+      </w:r>
+    </w:p>
+    <w:p>
+      <w:pPr>
+        <w:spacing w:before="0" w:after="0" w:line="360" w:lineRule="auto"/>
+        <w:jc w:val="center"/>
+        <w:rPr>
+          <w:rFonts w:hint="default"/>
+          <w:b w:val="0"/>
+          <w:sz w:val="44"/>
+          <w:szCs w:val="44"/>
+          <w:lang w:val="en-US"/>
+        </w:rPr>
+      </w:pPr>
+      <w:r>
+        <w:rPr>
+          <w:rFonts w:hint="default"/>
+          <w:b w:val="0"/>
+          <w:sz w:val="44"/>
+          <w:szCs w:val="44"/>
+          <w:lang w:val="en-US"/>
+        </w:rPr>
+        <w:t>Khoula Marium (23K-0564)</w:t>
       </w:r>
     </w:p>
     <w:p>
@@ -205,9 +396,18 @@
         <w:spacing w:before="0" w:after="0" w:line="360" w:lineRule="auto"/>
         <w:jc w:val="center"/>
         <w:rPr>
+          <w:rFonts w:hint="default"/>
           <w:sz w:val="44"/>
           <w:szCs w:val="44"/>
+          <w:lang w:val="en-US"/>
         </w:rPr>
+        <w:sectPr>
+          <w:footerReference r:id="rId5" w:type="default"/>
+          <w:pgSz w:w="12240" w:h="15840"/>
+          <w:pgMar w:top="1440" w:right="1440" w:bottom="1440" w:left="1440" w:header="720" w:footer="720" w:gutter="0"/>
+          <w:cols w:space="720" w:num="1"/>
+          <w:docGrid w:linePitch="360" w:charSpace="0"/>
+        </w:sectPr>
       </w:pPr>
       <w:r>
         <w:rPr>
@@ -216,18 +416,18 @@
           <w:sz w:val="44"/>
           <w:szCs w:val="44"/>
         </w:rPr>
-        <w:t>Institution: FAST National University of Computer and Emerging Sciences (FAST-NUCES)</w:t>
+        <w:t xml:space="preserve">Date: </w:t>
       </w:r>
-    </w:p>
-    <w:p>
-      <w:pPr>
-        <w:spacing w:before="0" w:after="0" w:line="360" w:lineRule="auto"/>
-        <w:jc w:val="center"/>
+      <w:r>
         <w:rPr>
+          <w:rFonts w:hint="default"/>
+          <w:b w:val="0"/>
           <w:sz w:val="44"/>
           <w:szCs w:val="44"/>
+          <w:lang w:val="en-US"/>
         </w:rPr>
-      </w:pPr>
+        <w:t xml:space="preserve">1 </w:t>
+      </w:r>
       <w:r>
         <w:rPr>
           <w:rFonts w:ascii="Times New Roman" w:hAnsi="Times New Roman" w:eastAsia="Times New Roman"/>
@@ -235,19 +435,39 @@
           <w:sz w:val="44"/>
           <w:szCs w:val="44"/>
         </w:rPr>
-        <w:t>Date: May 2025</w:t>
+        <w:t>May</w:t>
       </w:r>
-    </w:p>
-    <w:p>
-      <w:pPr>
-        <w:sectPr>
-          <w:footerReference r:id="rId5" w:type="default"/>
-          <w:pgSz w:w="12240" w:h="15840"/>
-          <w:pgMar w:top="1440" w:right="1440" w:bottom="1440" w:left="1440" w:header="720" w:footer="720" w:gutter="0"/>
-          <w:cols w:space="720" w:num="1"/>
-          <w:docGrid w:linePitch="360" w:charSpace="0"/>
-        </w:sectPr>
-      </w:pPr>
+      <w:r>
+        <w:rPr>
+          <w:rFonts w:hint="default"/>
+          <w:b w:val="0"/>
+          <w:sz w:val="44"/>
+          <w:szCs w:val="44"/>
+          <w:lang w:val="en-US"/>
+        </w:rPr>
+        <w:t>,</w:t>
+      </w:r>
+      <w:bookmarkStart w:id="0" w:name="_GoBack"/>
+      <w:bookmarkEnd w:id="0"/>
+      <w:r>
+        <w:rPr>
+          <w:rFonts w:ascii="Times New Roman" w:hAnsi="Times New Roman" w:eastAsia="Times New Roman"/>
+          <w:b w:val="0"/>
+          <w:sz w:val="44"/>
+          <w:szCs w:val="44"/>
+        </w:rPr>
+        <w:t xml:space="preserve"> 202</w:t>
+      </w:r>
+      <w:r>
+        <w:rPr>
+          <w:rFonts w:hint="default"/>
+          <w:b w:val="0"/>
+          <w:sz w:val="44"/>
+          <w:szCs w:val="44"/>
+          <w:lang w:val="en-US"/>
+        </w:rPr>
+        <w:t>6</w:t>
+      </w:r>
     </w:p>
     <w:p>
       <w:pPr>
@@ -1231,7 +1451,7 @@
                     </pic:cNvPicPr>
                   </pic:nvPicPr>
                   <pic:blipFill>
-                    <a:blip r:embed="rId7"/>
+                    <a:blip r:embed="rId8"/>
                     <a:stretch>
                       <a:fillRect/>
                     </a:stretch>
@@ -1290,7 +1510,7 @@
                     </pic:cNvPicPr>
                   </pic:nvPicPr>
                   <pic:blipFill>
-                    <a:blip r:embed="rId8"/>
+                    <a:blip r:embed="rId9"/>
                     <a:stretch>
                       <a:fillRect/>
                     </a:stretch>
@@ -1349,7 +1569,7 @@
                     </pic:cNvPicPr>
                   </pic:nvPicPr>
                   <pic:blipFill>
-                    <a:blip r:embed="rId9"/>
+                    <a:blip r:embed="rId10"/>
                     <a:stretch>
                       <a:fillRect/>
                     </a:stretch>
@@ -1408,7 +1628,7 @@
                     </pic:cNvPicPr>
                   </pic:nvPicPr>
                   <pic:blipFill>
-                    <a:blip r:embed="rId10"/>
+                    <a:blip r:embed="rId11"/>
                     <a:stretch>
                       <a:fillRect/>
                     </a:stretch>
@@ -1467,7 +1687,7 @@
                     </pic:cNvPicPr>
                   </pic:nvPicPr>
                   <pic:blipFill>
-                    <a:blip r:embed="rId11"/>
+                    <a:blip r:embed="rId12"/>
                     <a:stretch>
                       <a:fillRect/>
                     </a:stretch>
@@ -1521,65 +1741,6 @@
                 <pic:pic xmlns:pic="http://schemas.openxmlformats.org/drawingml/2006/picture">
                   <pic:nvPicPr>
                     <pic:cNvPr id="6" name="Picture 6"/>
-                    <pic:cNvPicPr>
-                      <a:picLocks noChangeAspect="1"/>
-                    </pic:cNvPicPr>
-                  </pic:nvPicPr>
-                  <pic:blipFill>
-                    <a:blip r:embed="rId12"/>
-                    <a:stretch>
-                      <a:fillRect/>
-                    </a:stretch>
-                  </pic:blipFill>
-                  <pic:spPr>
-                    <a:xfrm>
-                      <a:off x="0" y="0"/>
-                      <a:ext cx="5669280" cy="2217037"/>
-                    </a:xfrm>
-                    <a:prstGeom prst="rect">
-                      <a:avLst/>
-                    </a:prstGeom>
-                  </pic:spPr>
-                </pic:pic>
-              </a:graphicData>
-            </a:graphic>
-          </wp:inline>
-        </w:drawing>
-      </w:r>
-    </w:p>
-    <w:p>
-      <w:pPr>
-        <w:spacing w:before="0" w:after="0" w:line="360" w:lineRule="auto"/>
-        <w:jc w:val="center"/>
-      </w:pPr>
-      <w:r>
-        <w:rPr>
-          <w:rFonts w:ascii="Times New Roman" w:hAnsi="Times New Roman" w:eastAsia="Times New Roman"/>
-          <w:i/>
-          <w:sz w:val="24"/>
-        </w:rPr>
-        <w:t>Figure 6: Comparison of global and South Asia yearly average temperature trends.</w:t>
-      </w:r>
-    </w:p>
-    <w:p>
-      <w:pPr>
-        <w:spacing w:before="0" w:after="0" w:line="360" w:lineRule="auto"/>
-        <w:jc w:val="center"/>
-      </w:pPr>
-      <w:r>
-        <w:drawing>
-          <wp:inline distT="0" distB="0" distL="114300" distR="114300">
-            <wp:extent cx="5669280" cy="2216785"/>
-            <wp:effectExtent l="0" t="0" r="0" b="0"/>
-            <wp:docPr id="7" name="Picture 7"/>
-            <wp:cNvGraphicFramePr>
-              <a:graphicFrameLocks xmlns:a="http://schemas.openxmlformats.org/drawingml/2006/main" noChangeAspect="1"/>
-            </wp:cNvGraphicFramePr>
-            <a:graphic xmlns:a="http://schemas.openxmlformats.org/drawingml/2006/main">
-              <a:graphicData uri="http://schemas.openxmlformats.org/drawingml/2006/picture">
-                <pic:pic xmlns:pic="http://schemas.openxmlformats.org/drawingml/2006/picture">
-                  <pic:nvPicPr>
-                    <pic:cNvPr id="7" name="Picture 7"/>
                     <pic:cNvPicPr>
                       <a:picLocks noChangeAspect="1"/>
                     </pic:cNvPicPr>
@@ -1617,6 +1778,65 @@
           <w:i/>
           <w:sz w:val="24"/>
         </w:rPr>
+        <w:t>Figure 6: Comparison of global and South Asia yearly average temperature trends.</w:t>
+      </w:r>
+    </w:p>
+    <w:p>
+      <w:pPr>
+        <w:spacing w:before="0" w:after="0" w:line="360" w:lineRule="auto"/>
+        <w:jc w:val="center"/>
+      </w:pPr>
+      <w:r>
+        <w:drawing>
+          <wp:inline distT="0" distB="0" distL="114300" distR="114300">
+            <wp:extent cx="5669280" cy="2216785"/>
+            <wp:effectExtent l="0" t="0" r="0" b="0"/>
+            <wp:docPr id="7" name="Picture 7"/>
+            <wp:cNvGraphicFramePr>
+              <a:graphicFrameLocks xmlns:a="http://schemas.openxmlformats.org/drawingml/2006/main" noChangeAspect="1"/>
+            </wp:cNvGraphicFramePr>
+            <a:graphic xmlns:a="http://schemas.openxmlformats.org/drawingml/2006/main">
+              <a:graphicData uri="http://schemas.openxmlformats.org/drawingml/2006/picture">
+                <pic:pic xmlns:pic="http://schemas.openxmlformats.org/drawingml/2006/picture">
+                  <pic:nvPicPr>
+                    <pic:cNvPr id="7" name="Picture 7"/>
+                    <pic:cNvPicPr>
+                      <a:picLocks noChangeAspect="1"/>
+                    </pic:cNvPicPr>
+                  </pic:nvPicPr>
+                  <pic:blipFill>
+                    <a:blip r:embed="rId14"/>
+                    <a:stretch>
+                      <a:fillRect/>
+                    </a:stretch>
+                  </pic:blipFill>
+                  <pic:spPr>
+                    <a:xfrm>
+                      <a:off x="0" y="0"/>
+                      <a:ext cx="5669280" cy="2217037"/>
+                    </a:xfrm>
+                    <a:prstGeom prst="rect">
+                      <a:avLst/>
+                    </a:prstGeom>
+                  </pic:spPr>
+                </pic:pic>
+              </a:graphicData>
+            </a:graphic>
+          </wp:inline>
+        </w:drawing>
+      </w:r>
+    </w:p>
+    <w:p>
+      <w:pPr>
+        <w:spacing w:before="0" w:after="0" w:line="360" w:lineRule="auto"/>
+        <w:jc w:val="center"/>
+      </w:pPr>
+      <w:r>
+        <w:rPr>
+          <w:rFonts w:ascii="Times New Roman" w:hAnsi="Times New Roman" w:eastAsia="Times New Roman"/>
+          <w:i/>
+          <w:sz w:val="24"/>
+        </w:rPr>
         <w:t>Figure 7: Average temperature anomaly trend by decade.</w:t>
       </w:r>
     </w:p>
@@ -1644,7 +1864,7 @@
                     </pic:cNvPicPr>
                   </pic:nvPicPr>
                   <pic:blipFill>
-                    <a:blip r:embed="rId14"/>
+                    <a:blip r:embed="rId15"/>
                     <a:stretch>
                       <a:fillRect/>
                     </a:stretch>
@@ -3781,6 +4001,12 @@
             <w:insideH w:val="single" w:color="auto" w:sz="4" w:space="0"/>
             <w:insideV w:val="single" w:color="auto" w:sz="4" w:space="0"/>
           </w:tblBorders>
+          <w:tblCellMar>
+            <w:top w:w="0" w:type="dxa"/>
+            <w:left w:w="108" w:type="dxa"/>
+            <w:bottom w:w="0" w:type="dxa"/>
+            <w:right w:w="108" w:type="dxa"/>
+          </w:tblCellMar>
         </w:tblPrEx>
         <w:trPr>
           <w:jc w:val="center"/>
@@ -4166,7 +4392,7 @@
                     </pic:cNvPicPr>
                   </pic:nvPicPr>
                   <pic:blipFill>
-                    <a:blip r:embed="rId15"/>
+                    <a:blip r:embed="rId16"/>
                     <a:stretch>
                       <a:fillRect/>
                     </a:stretch>
@@ -4225,7 +4451,7 @@
                     </pic:cNvPicPr>
                   </pic:nvPicPr>
                   <pic:blipFill>
-                    <a:blip r:embed="rId16"/>
+                    <a:blip r:embed="rId17"/>
                     <a:stretch>
                       <a:fillRect/>
                     </a:stretch>
@@ -4284,7 +4510,7 @@
                     </pic:cNvPicPr>
                   </pic:nvPicPr>
                   <pic:blipFill>
-                    <a:blip r:embed="rId17"/>
+                    <a:blip r:embed="rId18"/>
                     <a:stretch>
                       <a:fillRect/>
                     </a:stretch>
@@ -4343,7 +4569,7 @@
                     </pic:cNvPicPr>
                   </pic:nvPicPr>
                   <pic:blipFill>
-                    <a:blip r:embed="rId18"/>
+                    <a:blip r:embed="rId19"/>
                     <a:stretch>
                       <a:fillRect/>
                     </a:stretch>
@@ -4855,7 +5081,7 @@
   <w:docDefaults>
     <w:rPrDefault>
       <w:rPr>
-        <w:rFonts w:asciiTheme="minorHAnsi" w:hAnsiTheme="minorHAnsi" w:eastAsiaTheme="minorEastAsia" w:cstheme="minorBidi"/>
+        <w:rFonts w:ascii="Times New Roman" w:hAnsi="Times New Roman" w:eastAsia="SimSun" w:cs="Times New Roman"/>
       </w:rPr>
     </w:rPrDefault>
     <w:pPrDefault/>
@@ -4911,12 +5137,12 @@
     <w:lsdException w:qFormat="1" w:uiPriority="99" w:semiHidden="0" w:name="List"/>
     <w:lsdException w:qFormat="1" w:uiPriority="99" w:semiHidden="0" w:name="List Bullet"/>
     <w:lsdException w:qFormat="1" w:uiPriority="99" w:semiHidden="0" w:name="List Number"/>
-    <w:lsdException w:uiPriority="99" w:semiHidden="0" w:name="List 2"/>
+    <w:lsdException w:qFormat="1" w:uiPriority="99" w:semiHidden="0" w:name="List 2"/>
     <w:lsdException w:qFormat="1" w:uiPriority="99" w:semiHidden="0" w:name="List 3"/>
     <w:lsdException w:uiPriority="99" w:name="List 4"/>
     <w:lsdException w:uiPriority="99" w:name="List 5"/>
     <w:lsdException w:qFormat="1" w:uiPriority="99" w:semiHidden="0" w:name="List Bullet 2"/>
-    <w:lsdException w:uiPriority="99" w:semiHidden="0" w:name="List Bullet 3"/>
+    <w:lsdException w:qFormat="1" w:uiPriority="99" w:semiHidden="0" w:name="List Bullet 3"/>
     <w:lsdException w:uiPriority="99" w:name="List Bullet 4"/>
     <w:lsdException w:uiPriority="99" w:name="List Bullet 5"/>
     <w:lsdException w:qFormat="1" w:uiPriority="99" w:semiHidden="0" w:name="List Number 2"/>
@@ -5500,6 +5726,7 @@
     <w:name w:val="List 2"/>
     <w:basedOn w:val="1"/>
     <w:unhideWhenUsed/>
+    <w:qFormat/>
     <w:uiPriority w:val="99"/>
     <w:pPr>
       <w:ind w:left="720" w:hanging="360"/>
@@ -5549,6 +5776,7 @@
     <w:name w:val="List Bullet 3"/>
     <w:basedOn w:val="1"/>
     <w:unhideWhenUsed/>
+    <w:qFormat/>
     <w:uiPriority w:val="99"/>
     <w:pPr>
       <w:numPr>

</xml_diff>